<commit_message>
Possibly last documentation update
</commit_message>
<xml_diff>
--- a/docs/Doneva-authorship report.docx
+++ b/docs/Doneva-authorship report.docx
@@ -1840,7 +1840,7 @@
                 <w:sz w:val="24"/>
                 <w:szCs w:val="24"/>
               </w:rPr>
-              <w:t>9</w:t>
+              <w:t>8</w:t>
             </w:r>
           </w:p>
         </w:tc>
@@ -3586,7 +3586,39 @@
                 <w:sz w:val="24"/>
                 <w:szCs w:val="24"/>
               </w:rPr>
-              <w:t>This file performs acceptance testing of processing a script under 20s.</w:t>
+              <w:t>This file performs acceptance testing of processing a script under 20</w:t>
+            </w:r>
+            <w:r>
+              <w:rPr>
+                <w:rFonts w:ascii="Arial" w:hAnsi="Arial" w:cs="Arial"/>
+                <w:sz w:val="24"/>
+                <w:szCs w:val="24"/>
+              </w:rPr>
+              <w:t xml:space="preserve"> </w:t>
+            </w:r>
+            <w:r>
+              <w:rPr>
+                <w:rFonts w:ascii="Arial" w:hAnsi="Arial" w:cs="Arial"/>
+                <w:sz w:val="24"/>
+                <w:szCs w:val="24"/>
+              </w:rPr>
+              <w:t>s</w:t>
+            </w:r>
+            <w:r>
+              <w:rPr>
+                <w:rFonts w:ascii="Arial" w:hAnsi="Arial" w:cs="Arial"/>
+                <w:sz w:val="24"/>
+                <w:szCs w:val="24"/>
+              </w:rPr>
+              <w:t>econds</w:t>
+            </w:r>
+            <w:r>
+              <w:rPr>
+                <w:rFonts w:ascii="Arial" w:hAnsi="Arial" w:cs="Arial"/>
+                <w:sz w:val="24"/>
+                <w:szCs w:val="24"/>
+              </w:rPr>
+              <w:t>.</w:t>
             </w:r>
           </w:p>
         </w:tc>
@@ -3847,7 +3879,17 @@
           <w:sz w:val="24"/>
           <w:szCs w:val="24"/>
         </w:rPr>
-        <w:t>504</w:t>
+        <w:t>50</w:t>
+      </w:r>
+      <w:r>
+        <w:rPr>
+          <w:rFonts w:ascii="Arial" w:hAnsi="Arial" w:cs="Arial"/>
+          <w:b/>
+          <w:bCs/>
+          <w:sz w:val="24"/>
+          <w:szCs w:val="24"/>
+        </w:rPr>
+        <w:t>3</w:t>
       </w:r>
     </w:p>
     <w:sectPr>

</xml_diff>